<commit_message>
Add six model validation and schedule appendix pages to report
</commit_message>
<xml_diff>
--- a/reports/INE4107_midterm_report_final.docx
+++ b/reports/INE4107_midterm_report_final.docx
@@ -4983,6 +4983,714 @@
           <w:sz w:val="22"/>
         </w:rPr>
         <w:t xml:space="preserve">모든 모델에 같은 절차를 적용했지만 공개 6개를 반복 확인하며 개발했으므로 비공개 일반화는 별도 검증이 필요하다. 향후 공정에 적합한 미사용 형상과 고정 설정으로 PASS율·makespan·계산 시간·실패 원인을 평가한다. 현재 결과는 전역 최적성이나 실물 제조 품질을 증명하지 않는다.</w:t>
+      </w:r>
+    </w:p>
+    <w:p>
+      <w:pPr>
+        <w:pStyle w:val="a6"/>
+        <w:spacing w:before="0" w:after="90" w:line="250" w:lineRule="auto"/>
+        <w:keepNext/>
+        <w:pageBreakBefore/>
+      </w:pPr>
+      <w:r>
+        <w:rPr>
+          <w:color w:val="000000"/>
+        </w:rPr>
+        <w:t>부록 Model 01 Honeycomb</w:t>
+      </w:r>
+    </w:p>
+    <w:p>
+      <w:pPr>
+        <w:pStyle w:val="a"/>
+        <w:spacing w:before="0" w:after="90" w:line="250" w:lineRule="auto"/>
+      </w:pPr>
+      <w:r>
+        <w:rPr>
+          <w:color w:val="000000"/>
+        </w:rPr>
+        <w:t>Validator 검증 결과</w:t>
+      </w:r>
+    </w:p>
+    <w:p xmlns:a="http://schemas.openxmlformats.org/drawingml/2006/main" xmlns:pic="http://schemas.openxmlformats.org/drawingml/2006/picture">
+      <w:pPr>
+        <w:jc w:val="center"/>
+        <w:spacing w:before="100" w:after="180"/>
+      </w:pPr>
+      <w:r>
+        <w:drawing>
+          <wp:inline>
+            <wp:extent cx="5669280" cy="2077562"/>
+            <wp:docPr id="6002" name="result_01"/>
+            <a:graphic>
+              <a:graphicData uri="http://schemas.openxmlformats.org/drawingml/2006/picture">
+                <pic:pic>
+                  <pic:nvPicPr>
+                    <pic:cNvPr id="0" name="result_01"/>
+                    <pic:cNvPicPr/>
+                  </pic:nvPicPr>
+                  <pic:blipFill>
+                    <a:blip r:embed="rIdAppendix6002"/>
+                    <a:stretch>
+                      <a:fillRect/>
+                    </a:stretch>
+                  </pic:blipFill>
+                  <pic:spPr>
+                    <a:xfrm>
+                      <a:off x="0" y="0"/>
+                      <a:ext cx="5669280" cy="2077562"/>
+                    </a:xfrm>
+                    <a:prstGeom prst="rect">
+                      <a:avLst/>
+                    </a:prstGeom>
+                  </pic:spPr>
+                </pic:pic>
+              </a:graphicData>
+            </a:graphic>
+          </wp:inline>
+        </w:drawing>
+      </w:r>
+    </w:p>
+    <w:p>
+      <w:pPr>
+        <w:pStyle w:val="a"/>
+        <w:spacing w:before="0" w:after="90" w:line="250" w:lineRule="auto"/>
+      </w:pPr>
+      <w:r>
+        <w:rPr>
+          <w:color w:val="000000"/>
+        </w:rPr>
+        <w:t>로봇 작업 시간표</w:t>
+      </w:r>
+    </w:p>
+    <w:p xmlns:a="http://schemas.openxmlformats.org/drawingml/2006/main" xmlns:pic="http://schemas.openxmlformats.org/drawingml/2006/picture">
+      <w:pPr>
+        <w:jc w:val="center"/>
+        <w:spacing w:before="100" w:after="180"/>
+      </w:pPr>
+      <w:r>
+        <w:drawing>
+          <wp:inline>
+            <wp:extent cx="5669280" cy="1655840"/>
+            <wp:docPr id="6003" name="newplot_01"/>
+            <a:graphic>
+              <a:graphicData uri="http://schemas.openxmlformats.org/drawingml/2006/picture">
+                <pic:pic>
+                  <pic:nvPicPr>
+                    <pic:cNvPr id="0" name="newplot_01"/>
+                    <pic:cNvPicPr/>
+                  </pic:nvPicPr>
+                  <pic:blipFill>
+                    <a:blip r:embed="rIdAppendix6003"/>
+                    <a:stretch>
+                      <a:fillRect/>
+                    </a:stretch>
+                  </pic:blipFill>
+                  <pic:spPr>
+                    <a:xfrm>
+                      <a:off x="0" y="0"/>
+                      <a:ext cx="5669280" cy="1655840"/>
+                    </a:xfrm>
+                    <a:prstGeom prst="rect">
+                      <a:avLst/>
+                    </a:prstGeom>
+                  </pic:spPr>
+                </pic:pic>
+              </a:graphicData>
+            </a:graphic>
+          </wp:inline>
+        </w:drawing>
+      </w:r>
+    </w:p>
+    <w:p>
+      <w:pPr>
+        <w:pStyle w:val="a"/>
+        <w:spacing w:before="0" w:after="90" w:line="250" w:lineRule="auto"/>
+      </w:pPr>
+      <w:r>
+        <w:rPr>
+          <w:color w:val="000000"/>
+        </w:rPr>
+        <w:t>시간표는 0~300초 확대 화면이다. 전체 Makespan은 694.25초다.</w:t>
+      </w:r>
+    </w:p>
+    <w:p>
+      <w:pPr>
+        <w:pStyle w:val="a6"/>
+        <w:spacing w:before="0" w:after="90" w:line="250" w:lineRule="auto"/>
+        <w:keepNext/>
+        <w:pageBreakBefore/>
+      </w:pPr>
+      <w:r>
+        <w:rPr>
+          <w:color w:val="000000"/>
+        </w:rPr>
+        <w:t>부록 Model 02 Spiral</w:t>
+      </w:r>
+    </w:p>
+    <w:p>
+      <w:pPr>
+        <w:pStyle w:val="a"/>
+        <w:spacing w:before="0" w:after="90" w:line="250" w:lineRule="auto"/>
+      </w:pPr>
+      <w:r>
+        <w:rPr>
+          <w:color w:val="000000"/>
+        </w:rPr>
+        <w:t>Validator 검증 결과</w:t>
+      </w:r>
+    </w:p>
+    <w:p xmlns:a="http://schemas.openxmlformats.org/drawingml/2006/main" xmlns:pic="http://schemas.openxmlformats.org/drawingml/2006/picture">
+      <w:pPr>
+        <w:jc w:val="center"/>
+        <w:spacing w:before="100" w:after="180"/>
+      </w:pPr>
+      <w:r>
+        <w:drawing>
+          <wp:inline>
+            <wp:extent cx="5669280" cy="2088285"/>
+            <wp:docPr id="6004" name="result_02"/>
+            <a:graphic>
+              <a:graphicData uri="http://schemas.openxmlformats.org/drawingml/2006/picture">
+                <pic:pic>
+                  <pic:nvPicPr>
+                    <pic:cNvPr id="0" name="result_02"/>
+                    <pic:cNvPicPr/>
+                  </pic:nvPicPr>
+                  <pic:blipFill>
+                    <a:blip r:embed="rIdAppendix6004"/>
+                    <a:stretch>
+                      <a:fillRect/>
+                    </a:stretch>
+                  </pic:blipFill>
+                  <pic:spPr>
+                    <a:xfrm>
+                      <a:off x="0" y="0"/>
+                      <a:ext cx="5669280" cy="2088285"/>
+                    </a:xfrm>
+                    <a:prstGeom prst="rect">
+                      <a:avLst/>
+                    </a:prstGeom>
+                  </pic:spPr>
+                </pic:pic>
+              </a:graphicData>
+            </a:graphic>
+          </wp:inline>
+        </w:drawing>
+      </w:r>
+    </w:p>
+    <w:p>
+      <w:pPr>
+        <w:pStyle w:val="a"/>
+        <w:spacing w:before="0" w:after="90" w:line="250" w:lineRule="auto"/>
+      </w:pPr>
+      <w:r>
+        <w:rPr>
+          <w:color w:val="000000"/>
+        </w:rPr>
+        <w:t>로봇 작업 시간표</w:t>
+      </w:r>
+    </w:p>
+    <w:p xmlns:a="http://schemas.openxmlformats.org/drawingml/2006/main" xmlns:pic="http://schemas.openxmlformats.org/drawingml/2006/picture">
+      <w:pPr>
+        <w:jc w:val="center"/>
+        <w:spacing w:before="100" w:after="180"/>
+      </w:pPr>
+      <w:r>
+        <w:drawing>
+          <wp:inline>
+            <wp:extent cx="5669280" cy="1655840"/>
+            <wp:docPr id="6005" name="newplot_02"/>
+            <a:graphic>
+              <a:graphicData uri="http://schemas.openxmlformats.org/drawingml/2006/picture">
+                <pic:pic>
+                  <pic:nvPicPr>
+                    <pic:cNvPr id="0" name="newplot_02"/>
+                    <pic:cNvPicPr/>
+                  </pic:nvPicPr>
+                  <pic:blipFill>
+                    <a:blip r:embed="rIdAppendix6005"/>
+                    <a:stretch>
+                      <a:fillRect/>
+                    </a:stretch>
+                  </pic:blipFill>
+                  <pic:spPr>
+                    <a:xfrm>
+                      <a:off x="0" y="0"/>
+                      <a:ext cx="5669280" cy="1655840"/>
+                    </a:xfrm>
+                    <a:prstGeom prst="rect">
+                      <a:avLst/>
+                    </a:prstGeom>
+                  </pic:spPr>
+                </pic:pic>
+              </a:graphicData>
+            </a:graphic>
+          </wp:inline>
+        </w:drawing>
+      </w:r>
+    </w:p>
+    <w:p>
+      <w:pPr>
+        <w:pStyle w:val="a6"/>
+        <w:spacing w:before="0" w:after="90" w:line="250" w:lineRule="auto"/>
+        <w:keepNext/>
+        <w:pageBreakBefore/>
+      </w:pPr>
+      <w:r>
+        <w:rPr>
+          <w:color w:val="000000"/>
+        </w:rPr>
+        <w:t>부록 Model 03 Triangular truss</w:t>
+      </w:r>
+    </w:p>
+    <w:p>
+      <w:pPr>
+        <w:pStyle w:val="a"/>
+        <w:spacing w:before="0" w:after="90" w:line="250" w:lineRule="auto"/>
+      </w:pPr>
+      <w:r>
+        <w:rPr>
+          <w:color w:val="000000"/>
+        </w:rPr>
+        <w:t>Validator 검증 결과</w:t>
+      </w:r>
+    </w:p>
+    <w:p xmlns:a="http://schemas.openxmlformats.org/drawingml/2006/main" xmlns:pic="http://schemas.openxmlformats.org/drawingml/2006/picture">
+      <w:pPr>
+        <w:jc w:val="center"/>
+        <w:spacing w:before="100" w:after="180"/>
+      </w:pPr>
+      <w:r>
+        <w:drawing>
+          <wp:inline>
+            <wp:extent cx="5669280" cy="2134198"/>
+            <wp:docPr id="6006" name="result_03"/>
+            <a:graphic>
+              <a:graphicData uri="http://schemas.openxmlformats.org/drawingml/2006/picture">
+                <pic:pic>
+                  <pic:nvPicPr>
+                    <pic:cNvPr id="0" name="result_03"/>
+                    <pic:cNvPicPr/>
+                  </pic:nvPicPr>
+                  <pic:blipFill>
+                    <a:blip r:embed="rIdAppendix6006"/>
+                    <a:stretch>
+                      <a:fillRect/>
+                    </a:stretch>
+                  </pic:blipFill>
+                  <pic:spPr>
+                    <a:xfrm>
+                      <a:off x="0" y="0"/>
+                      <a:ext cx="5669280" cy="2134198"/>
+                    </a:xfrm>
+                    <a:prstGeom prst="rect">
+                      <a:avLst/>
+                    </a:prstGeom>
+                  </pic:spPr>
+                </pic:pic>
+              </a:graphicData>
+            </a:graphic>
+          </wp:inline>
+        </w:drawing>
+      </w:r>
+    </w:p>
+    <w:p>
+      <w:pPr>
+        <w:pStyle w:val="a"/>
+        <w:spacing w:before="0" w:after="90" w:line="250" w:lineRule="auto"/>
+      </w:pPr>
+      <w:r>
+        <w:rPr>
+          <w:color w:val="000000"/>
+        </w:rPr>
+        <w:t>로봇 작업 시간표</w:t>
+      </w:r>
+    </w:p>
+    <w:p xmlns:a="http://schemas.openxmlformats.org/drawingml/2006/main" xmlns:pic="http://schemas.openxmlformats.org/drawingml/2006/picture">
+      <w:pPr>
+        <w:jc w:val="center"/>
+        <w:spacing w:before="100" w:after="180"/>
+      </w:pPr>
+      <w:r>
+        <w:drawing>
+          <wp:inline>
+            <wp:extent cx="5669280" cy="1655840"/>
+            <wp:docPr id="6007" name="newplot_03"/>
+            <a:graphic>
+              <a:graphicData uri="http://schemas.openxmlformats.org/drawingml/2006/picture">
+                <pic:pic>
+                  <pic:nvPicPr>
+                    <pic:cNvPr id="0" name="newplot_03"/>
+                    <pic:cNvPicPr/>
+                  </pic:nvPicPr>
+                  <pic:blipFill>
+                    <a:blip r:embed="rIdAppendix6007"/>
+                    <a:stretch>
+                      <a:fillRect/>
+                    </a:stretch>
+                  </pic:blipFill>
+                  <pic:spPr>
+                    <a:xfrm>
+                      <a:off x="0" y="0"/>
+                      <a:ext cx="5669280" cy="1655840"/>
+                    </a:xfrm>
+                    <a:prstGeom prst="rect">
+                      <a:avLst/>
+                    </a:prstGeom>
+                  </pic:spPr>
+                </pic:pic>
+              </a:graphicData>
+            </a:graphic>
+          </wp:inline>
+        </w:drawing>
+      </w:r>
+    </w:p>
+    <w:p>
+      <w:pPr>
+        <w:pStyle w:val="a6"/>
+        <w:spacing w:before="0" w:after="90" w:line="250" w:lineRule="auto"/>
+        <w:keepNext/>
+        <w:pageBreakBefore/>
+      </w:pPr>
+      <w:r>
+        <w:rPr>
+          <w:color w:val="000000"/>
+        </w:rPr>
+        <w:t>부록 Model 04 Motor inner</w:t>
+      </w:r>
+    </w:p>
+    <w:p>
+      <w:pPr>
+        <w:pStyle w:val="a"/>
+        <w:spacing w:before="0" w:after="90" w:line="250" w:lineRule="auto"/>
+      </w:pPr>
+      <w:r>
+        <w:rPr>
+          <w:color w:val="000000"/>
+        </w:rPr>
+        <w:t>Validator 검증 결과</w:t>
+      </w:r>
+    </w:p>
+    <w:p xmlns:a="http://schemas.openxmlformats.org/drawingml/2006/main" xmlns:pic="http://schemas.openxmlformats.org/drawingml/2006/picture">
+      <w:pPr>
+        <w:jc w:val="center"/>
+        <w:spacing w:before="100" w:after="180"/>
+      </w:pPr>
+      <w:r>
+        <w:drawing>
+          <wp:inline>
+            <wp:extent cx="5669280" cy="2132251"/>
+            <wp:docPr id="6008" name="result_04"/>
+            <a:graphic>
+              <a:graphicData uri="http://schemas.openxmlformats.org/drawingml/2006/picture">
+                <pic:pic>
+                  <pic:nvPicPr>
+                    <pic:cNvPr id="0" name="result_04"/>
+                    <pic:cNvPicPr/>
+                  </pic:nvPicPr>
+                  <pic:blipFill>
+                    <a:blip r:embed="rIdAppendix6008"/>
+                    <a:stretch>
+                      <a:fillRect/>
+                    </a:stretch>
+                  </pic:blipFill>
+                  <pic:spPr>
+                    <a:xfrm>
+                      <a:off x="0" y="0"/>
+                      <a:ext cx="5669280" cy="2132251"/>
+                    </a:xfrm>
+                    <a:prstGeom prst="rect">
+                      <a:avLst/>
+                    </a:prstGeom>
+                  </pic:spPr>
+                </pic:pic>
+              </a:graphicData>
+            </a:graphic>
+          </wp:inline>
+        </w:drawing>
+      </w:r>
+    </w:p>
+    <w:p>
+      <w:pPr>
+        <w:pStyle w:val="a"/>
+        <w:spacing w:before="0" w:after="90" w:line="250" w:lineRule="auto"/>
+      </w:pPr>
+      <w:r>
+        <w:rPr>
+          <w:color w:val="000000"/>
+        </w:rPr>
+        <w:t>로봇 작업 시간표</w:t>
+      </w:r>
+    </w:p>
+    <w:p xmlns:a="http://schemas.openxmlformats.org/drawingml/2006/main" xmlns:pic="http://schemas.openxmlformats.org/drawingml/2006/picture">
+      <w:pPr>
+        <w:jc w:val="center"/>
+        <w:spacing w:before="100" w:after="180"/>
+      </w:pPr>
+      <w:r>
+        <w:drawing>
+          <wp:inline>
+            <wp:extent cx="5669280" cy="1498141"/>
+            <wp:docPr id="6009" name="newplot_04"/>
+            <a:graphic>
+              <a:graphicData uri="http://schemas.openxmlformats.org/drawingml/2006/picture">
+                <pic:pic>
+                  <pic:nvPicPr>
+                    <pic:cNvPr id="0" name="newplot_04"/>
+                    <pic:cNvPicPr/>
+                  </pic:nvPicPr>
+                  <pic:blipFill>
+                    <a:blip r:embed="rIdAppendix6009"/>
+                    <a:stretch>
+                      <a:fillRect/>
+                    </a:stretch>
+                  </pic:blipFill>
+                  <pic:spPr>
+                    <a:xfrm>
+                      <a:off x="0" y="0"/>
+                      <a:ext cx="5669280" cy="1498141"/>
+                    </a:xfrm>
+                    <a:prstGeom prst="rect">
+                      <a:avLst/>
+                    </a:prstGeom>
+                  </pic:spPr>
+                </pic:pic>
+              </a:graphicData>
+            </a:graphic>
+          </wp:inline>
+        </w:drawing>
+      </w:r>
+    </w:p>
+    <w:p>
+      <w:pPr>
+        <w:pStyle w:val="a6"/>
+        <w:spacing w:before="0" w:after="90" w:line="250" w:lineRule="auto"/>
+        <w:keepNext/>
+        <w:pageBreakBefore/>
+      </w:pPr>
+      <w:r>
+        <w:rPr>
+          <w:color w:val="000000"/>
+        </w:rPr>
+        <w:t>부록 Model 05 Twisted shell</w:t>
+      </w:r>
+    </w:p>
+    <w:p>
+      <w:pPr>
+        <w:pStyle w:val="a"/>
+        <w:spacing w:before="0" w:after="90" w:line="250" w:lineRule="auto"/>
+      </w:pPr>
+      <w:r>
+        <w:rPr>
+          <w:color w:val="000000"/>
+        </w:rPr>
+        <w:t>Validator 검증 결과</w:t>
+      </w:r>
+    </w:p>
+    <w:p xmlns:a="http://schemas.openxmlformats.org/drawingml/2006/main" xmlns:pic="http://schemas.openxmlformats.org/drawingml/2006/picture">
+      <w:pPr>
+        <w:jc w:val="center"/>
+        <w:spacing w:before="100" w:after="180"/>
+      </w:pPr>
+      <w:r>
+        <w:drawing>
+          <wp:inline>
+            <wp:extent cx="5669280" cy="2161272"/>
+            <wp:docPr id="6010" name="result_05"/>
+            <a:graphic>
+              <a:graphicData uri="http://schemas.openxmlformats.org/drawingml/2006/picture">
+                <pic:pic>
+                  <pic:nvPicPr>
+                    <pic:cNvPr id="0" name="result_05"/>
+                    <pic:cNvPicPr/>
+                  </pic:nvPicPr>
+                  <pic:blipFill>
+                    <a:blip r:embed="rIdAppendix6010"/>
+                    <a:stretch>
+                      <a:fillRect/>
+                    </a:stretch>
+                  </pic:blipFill>
+                  <pic:spPr>
+                    <a:xfrm>
+                      <a:off x="0" y="0"/>
+                      <a:ext cx="5669280" cy="2161272"/>
+                    </a:xfrm>
+                    <a:prstGeom prst="rect">
+                      <a:avLst/>
+                    </a:prstGeom>
+                  </pic:spPr>
+                </pic:pic>
+              </a:graphicData>
+            </a:graphic>
+          </wp:inline>
+        </w:drawing>
+      </w:r>
+    </w:p>
+    <w:p>
+      <w:pPr>
+        <w:pStyle w:val="a"/>
+        <w:spacing w:before="0" w:after="90" w:line="250" w:lineRule="auto"/>
+      </w:pPr>
+      <w:r>
+        <w:rPr>
+          <w:color w:val="000000"/>
+        </w:rPr>
+        <w:t>로봇 작업 시간표</w:t>
+      </w:r>
+    </w:p>
+    <w:p xmlns:a="http://schemas.openxmlformats.org/drawingml/2006/main" xmlns:pic="http://schemas.openxmlformats.org/drawingml/2006/picture">
+      <w:pPr>
+        <w:jc w:val="center"/>
+        <w:spacing w:before="100" w:after="180"/>
+      </w:pPr>
+      <w:r>
+        <w:drawing>
+          <wp:inline>
+            <wp:extent cx="5669280" cy="1498141"/>
+            <wp:docPr id="6011" name="newplot_05"/>
+            <a:graphic>
+              <a:graphicData uri="http://schemas.openxmlformats.org/drawingml/2006/picture">
+                <pic:pic>
+                  <pic:nvPicPr>
+                    <pic:cNvPr id="0" name="newplot_05"/>
+                    <pic:cNvPicPr/>
+                  </pic:nvPicPr>
+                  <pic:blipFill>
+                    <a:blip r:embed="rIdAppendix6011"/>
+                    <a:stretch>
+                      <a:fillRect/>
+                    </a:stretch>
+                  </pic:blipFill>
+                  <pic:spPr>
+                    <a:xfrm>
+                      <a:off x="0" y="0"/>
+                      <a:ext cx="5669280" cy="1498141"/>
+                    </a:xfrm>
+                    <a:prstGeom prst="rect">
+                      <a:avLst/>
+                    </a:prstGeom>
+                  </pic:spPr>
+                </pic:pic>
+              </a:graphicData>
+            </a:graphic>
+          </wp:inline>
+        </w:drawing>
+      </w:r>
+    </w:p>
+    <w:p>
+      <w:pPr>
+        <w:pStyle w:val="a6"/>
+        <w:spacing w:before="0" w:after="90" w:line="250" w:lineRule="auto"/>
+        <w:keepNext/>
+        <w:pageBreakBefore/>
+      </w:pPr>
+      <w:r>
+        <w:rPr>
+          <w:color w:val="000000"/>
+        </w:rPr>
+        <w:t>부록 Model 06 Angle frame</w:t>
+      </w:r>
+    </w:p>
+    <w:p>
+      <w:pPr>
+        <w:pStyle w:val="a"/>
+        <w:spacing w:before="0" w:after="90" w:line="250" w:lineRule="auto"/>
+      </w:pPr>
+      <w:r>
+        <w:rPr>
+          <w:color w:val="000000"/>
+        </w:rPr>
+        <w:t>Validator 검증 결과</w:t>
+      </w:r>
+    </w:p>
+    <w:p xmlns:a="http://schemas.openxmlformats.org/drawingml/2006/main" xmlns:pic="http://schemas.openxmlformats.org/drawingml/2006/picture">
+      <w:pPr>
+        <w:jc w:val="center"/>
+        <w:spacing w:before="100" w:after="180"/>
+      </w:pPr>
+      <w:r>
+        <w:drawing>
+          <wp:inline>
+            <wp:extent cx="5669280" cy="2170999"/>
+            <wp:docPr id="6012" name="result_06"/>
+            <a:graphic>
+              <a:graphicData uri="http://schemas.openxmlformats.org/drawingml/2006/picture">
+                <pic:pic>
+                  <pic:nvPicPr>
+                    <pic:cNvPr id="0" name="result_06"/>
+                    <pic:cNvPicPr/>
+                  </pic:nvPicPr>
+                  <pic:blipFill>
+                    <a:blip r:embed="rIdAppendix6012"/>
+                    <a:stretch>
+                      <a:fillRect/>
+                    </a:stretch>
+                  </pic:blipFill>
+                  <pic:spPr>
+                    <a:xfrm>
+                      <a:off x="0" y="0"/>
+                      <a:ext cx="5669280" cy="2170999"/>
+                    </a:xfrm>
+                    <a:prstGeom prst="rect">
+                      <a:avLst/>
+                    </a:prstGeom>
+                  </pic:spPr>
+                </pic:pic>
+              </a:graphicData>
+            </a:graphic>
+          </wp:inline>
+        </w:drawing>
+      </w:r>
+    </w:p>
+    <w:p>
+      <w:pPr>
+        <w:pStyle w:val="a"/>
+        <w:spacing w:before="0" w:after="90" w:line="250" w:lineRule="auto"/>
+      </w:pPr>
+      <w:r>
+        <w:rPr>
+          <w:color w:val="000000"/>
+        </w:rPr>
+        <w:t>로봇 작업 시간표</w:t>
+      </w:r>
+    </w:p>
+    <w:p xmlns:a="http://schemas.openxmlformats.org/drawingml/2006/main" xmlns:pic="http://schemas.openxmlformats.org/drawingml/2006/picture">
+      <w:pPr>
+        <w:jc w:val="center"/>
+        <w:spacing w:before="100" w:after="180"/>
+      </w:pPr>
+      <w:r>
+        <w:drawing>
+          <wp:inline>
+            <wp:extent cx="5669280" cy="1655840"/>
+            <wp:docPr id="6013" name="newplot_06"/>
+            <a:graphic>
+              <a:graphicData uri="http://schemas.openxmlformats.org/drawingml/2006/picture">
+                <pic:pic>
+                  <pic:nvPicPr>
+                    <pic:cNvPr id="0" name="newplot_06"/>
+                    <pic:cNvPicPr/>
+                  </pic:nvPicPr>
+                  <pic:blipFill>
+                    <a:blip r:embed="rIdAppendix6013"/>
+                    <a:stretch>
+                      <a:fillRect/>
+                    </a:stretch>
+                  </pic:blipFill>
+                  <pic:spPr>
+                    <a:xfrm>
+                      <a:off x="0" y="0"/>
+                      <a:ext cx="5669280" cy="1655840"/>
+                    </a:xfrm>
+                    <a:prstGeom prst="rect">
+                      <a:avLst/>
+                    </a:prstGeom>
+                  </pic:spPr>
+                </pic:pic>
+              </a:graphicData>
+            </a:graphic>
+          </wp:inline>
+        </w:drawing>
       </w:r>
     </w:p>
     <w:sectPr>

</xml_diff>